<commit_message>
Limit WHERETO badges to steps 4–6 items; add optional GRASPS
WHERETO letters now sit on each item of steps 4–6: field labels,
phase-specific badges on each activity row, and every 작성 점검 line.
The legend strip shows only on those steps.

평가 gains a collapsible GRASPS block (goal, role, audience,
situation, product, standards). Filled lines appear as a 수행 과제
row above the 평가 table in the preview and DOCX; the AI prompt
proposes GRASPS and keeps any the teacher wrote. Manual updated.

Co-Authored-By: Claude Opus 5.5 <noreply@anthropic.com>
Claude-Session: https://claude.ai/code/session_01TB7h27uoHbLW2mnKS1D44W
</commit_message>
<xml_diff>
--- a/examples/예시_교수학습과정안.docx
+++ b/examples/예시_교수학습과정안.docx
@@ -1229,6 +1229,138 @@
                 <w:b/>
                 <w:bCs/>
               </w:rPr>
+              <w:t xml:space="preserve">수행 과제</w:t>
+            </w:r>
+          </w:p>
+          <w:p>
+            <w:pPr>
+              <w:spacing w:before="0" w:after="0" w:line="264" w:lineRule="auto"/>
+              <w:jc w:val="center"/>
+            </w:pPr>
+            <w:r>
+              <w:rPr>
+                <w:b/>
+                <w:bCs/>
+              </w:rPr>
+              <w:t xml:space="preserve">(GRASPS)</w:t>
+            </w:r>
+          </w:p>
+        </w:tc>
+        <w:tc>
+          <w:tcPr>
+            <w:tcW w:w="7427" w:type="dxa"/>
+            <w:gridSpan w:val="4"/>
+            <w:vAlign w:val="center"/>
+          </w:tcPr>
+          <w:p>
+            <w:pPr>
+              <w:spacing w:before="0" w:after="0" w:line="264" w:lineRule="auto"/>
+            </w:pPr>
+            <w:r>
+              <w:rPr>
+                <w:b/>
+                <w:bCs/>
+              </w:rPr>
+              <w:t xml:space="preserve">G 목표</w:t>
+            </w:r>
+            <w:r>
+              <w:t xml:space="preserve">: 우리 지역 국가유산의 역사적 의미를 알리기</w:t>
+            </w:r>
+          </w:p>
+          <w:p>
+            <w:pPr>
+              <w:spacing w:before="0" w:after="0" w:line="264" w:lineRule="auto"/>
+            </w:pPr>
+            <w:r>
+              <w:rPr>
+                <w:b/>
+                <w:bCs/>
+              </w:rPr>
+              <w:t xml:space="preserve">R 역할</w:t>
+            </w:r>
+            <w:r>
+              <w:t xml:space="preserve">: 우리 지역 문화유산 해설사</w:t>
+            </w:r>
+          </w:p>
+          <w:p>
+            <w:pPr>
+              <w:spacing w:before="0" w:after="0" w:line="264" w:lineRule="auto"/>
+            </w:pPr>
+            <w:r>
+              <w:rPr>
+                <w:b/>
+                <w:bCs/>
+              </w:rPr>
+              <w:t xml:space="preserve">A 대상</w:t>
+            </w:r>
+            <w:r>
+              <w:t xml:space="preserve">: 우리 학교 1~2학년 동생들</w:t>
+            </w:r>
+          </w:p>
+          <w:p>
+            <w:pPr>
+              <w:spacing w:before="0" w:after="0" w:line="264" w:lineRule="auto"/>
+            </w:pPr>
+            <w:r>
+              <w:rPr>
+                <w:b/>
+                <w:bCs/>
+              </w:rPr>
+              <w:t xml:space="preserve">S 상황</w:t>
+            </w:r>
+            <w:r>
+              <w:t xml:space="preserve">: 학교 축제에서 「우리 지역 국가유산」 전시관을 연다</w:t>
+            </w:r>
+          </w:p>
+          <w:p>
+            <w:pPr>
+              <w:spacing w:before="0" w:after="0" w:line="264" w:lineRule="auto"/>
+            </w:pPr>
+            <w:r>
+              <w:rPr>
+                <w:b/>
+                <w:bCs/>
+              </w:rPr>
+              <w:t xml:space="preserve">P 수행·산출물</w:t>
+            </w:r>
+            <w:r>
+              <w:t xml:space="preserve">: 국가유산 소개 카드(패들렛)</w:t>
+            </w:r>
+          </w:p>
+          <w:p>
+            <w:pPr>
+              <w:spacing w:before="0" w:after="0" w:line="264" w:lineRule="auto"/>
+            </w:pPr>
+            <w:r>
+              <w:rPr>
+                <w:b/>
+                <w:bCs/>
+              </w:rPr>
+              <w:t xml:space="preserve">S 기준</w:t>
+            </w:r>
+            <w:r>
+              <w:t xml:space="preserve">: 정확한 정보 · 출처 표시 · 역사적 의미를 근거와 함께 설명</w:t>
+            </w:r>
+          </w:p>
+        </w:tc>
+      </w:tr>
+      <w:tr>
+        <w:tc>
+          <w:tcPr>
+            <w:tcW w:w="2211" w:type="dxa"/>
+            <w:shd w:val="clear" w:color="auto" w:fill="ECECEC"/>
+            <w:vAlign w:val="center"/>
+          </w:tcPr>
+          <w:p>
+            <w:pPr>
+              <w:spacing w:before="0" w:after="0" w:line="264" w:lineRule="auto"/>
+              <w:jc w:val="center"/>
+            </w:pPr>
+            <w:r>
+              <w:rPr>
+                <w:b/>
+                <w:bCs/>
+              </w:rPr>
               <w:t xml:space="preserve">평가 문항</w:t>
             </w:r>
           </w:p>

</xml_diff>